<commit_message>
TS 1.8 Ghanam Jatai Tamil final
</commit_message>
<xml_diff>
--- a/TS Jatai Ghanam Project/TS 1.8/TS 1.8 Jatai Tamil Corrections.docx
+++ b/TS Jatai Ghanam Project/TS 1.8/TS 1.8 Jatai Tamil Corrections.docx
@@ -70,10 +70,30 @@
           <w:bCs/>
           <w:sz w:val="32"/>
           <w:szCs w:val="32"/>
-          <w:highlight w:val="red"/>
           <w:u w:val="single"/>
         </w:rPr>
-        <w:t>????</w:t>
+        <w:t>30</w:t>
+      </w:r>
+      <w:r>
+        <w:rPr>
+          <w:b/>
+          <w:bCs/>
+          <w:sz w:val="32"/>
+          <w:szCs w:val="32"/>
+          <w:u w:val="single"/>
+          <w:vertAlign w:val="superscript"/>
+        </w:rPr>
+        <w:t>th</w:t>
+      </w:r>
+      <w:r>
+        <w:rPr>
+          <w:b/>
+          <w:bCs/>
+          <w:sz w:val="32"/>
+          <w:szCs w:val="32"/>
+          <w:u w:val="single"/>
+        </w:rPr>
+        <w:t xml:space="preserve"> June 2026</w:t>
       </w:r>
     </w:p>
     <w:p>
@@ -83,16 +103,14 @@
         <w:rPr>
           <w:b/>
           <w:bCs/>
-          <w:sz w:val="28"/>
-          <w:szCs w:val="32"/>
+          <w:szCs w:val="24"/>
         </w:rPr>
       </w:pPr>
       <w:r>
         <w:rPr>
           <w:b/>
           <w:bCs/>
-          <w:sz w:val="28"/>
-          <w:szCs w:val="32"/>
+          <w:szCs w:val="24"/>
         </w:rPr>
         <w:t>(ignore those which are already incorporated in your book’s version and date)</w:t>
       </w:r>
@@ -2549,6 +2567,19 @@
         </w:tc>
       </w:tr>
     </w:tbl>
+    <w:p>
+      <w:pPr>
+        <w:spacing w:before="0" w:line="240" w:lineRule="auto"/>
+        <w:jc w:val="center"/>
+        <w:rPr>
+          <w:b/>
+          <w:bCs/>
+          <w:sz w:val="32"/>
+          <w:szCs w:val="32"/>
+          <w:u w:val="single"/>
+        </w:rPr>
+      </w:pPr>
+    </w:p>
     <w:p>
       <w:pPr>
         <w:spacing w:before="0" w:line="240" w:lineRule="auto"/>

</xml_diff>